<commit_message>
fixed some minor things in the Soybean noteboook
</commit_message>
<xml_diff>
--- a/documents/MassSpec_TheoryReview.docx
+++ b/documents/MassSpec_TheoryReview.docx
@@ -46,9 +46,12 @@
     <w:sdt>
       <w:sdtPr>
         <w:rPr>
+          <w:rFonts w:asciiTheme="minorHAnsi" w:eastAsiaTheme="minorHAnsi" w:hAnsiTheme="minorHAnsi" w:cstheme="minorBidi"/>
           <w:b/>
           <w:bCs/>
           <w:color w:val="000000" w:themeColor="text1"/>
+          <w:sz w:val="24"/>
+          <w:szCs w:val="24"/>
         </w:rPr>
         <w:id w:val="-1882779156"/>
         <w:docPartObj>
@@ -58,11 +61,8 @@
       </w:sdtPr>
       <w:sdtEndPr>
         <w:rPr>
-          <w:rFonts w:asciiTheme="minorHAnsi" w:eastAsiaTheme="minorHAnsi" w:hAnsiTheme="minorHAnsi" w:cstheme="minorBidi"/>
           <w:noProof/>
           <w:color w:val="auto"/>
-          <w:sz w:val="24"/>
-          <w:szCs w:val="24"/>
         </w:rPr>
       </w:sdtEndPr>
       <w:sdtContent>
@@ -118,7 +118,7 @@
             </w:rPr>
             <w:fldChar w:fldCharType="separate"/>
           </w:r>
-          <w:hyperlink w:anchor="_Toc207009768" w:history="1">
+          <w:hyperlink w:anchor="_Toc207087286" w:history="1">
             <w:r>
               <w:rPr>
                 <w:rStyle w:val="Hyperlink"/>
@@ -145,7 +145,7 @@
                 <w:noProof/>
                 <w:webHidden/>
               </w:rPr>
-              <w:instrText xml:space="preserve"> PAGEREF _Toc207009768 \h </w:instrText>
+              <w:instrText xml:space="preserve"> PAGEREF _Toc207087286 \h </w:instrText>
             </w:r>
             <w:r>
               <w:rPr>
@@ -193,7 +193,7 @@
               <w14:ligatures w14:val="standardContextual"/>
             </w:rPr>
           </w:pPr>
-          <w:hyperlink w:anchor="_Toc207009769" w:history="1">
+          <w:hyperlink w:anchor="_Toc207087287" w:history="1">
             <w:r>
               <w:rPr>
                 <w:rStyle w:val="Hyperlink"/>
@@ -220,7 +220,7 @@
                 <w:noProof/>
                 <w:webHidden/>
               </w:rPr>
-              <w:instrText xml:space="preserve"> PAGEREF _Toc207009769 \h </w:instrText>
+              <w:instrText xml:space="preserve"> PAGEREF _Toc207087287 \h </w:instrText>
             </w:r>
             <w:r>
               <w:rPr>
@@ -268,7 +268,7 @@
               <w14:ligatures w14:val="standardContextual"/>
             </w:rPr>
           </w:pPr>
-          <w:hyperlink w:anchor="_Toc207009770" w:history="1">
+          <w:hyperlink w:anchor="_Toc207087288" w:history="1">
             <w:r>
               <w:rPr>
                 <w:rStyle w:val="Hyperlink"/>
@@ -295,7 +295,7 @@
                 <w:noProof/>
                 <w:webHidden/>
               </w:rPr>
-              <w:instrText xml:space="preserve"> PAGEREF _Toc207009770 \h </w:instrText>
+              <w:instrText xml:space="preserve"> PAGEREF _Toc207087288 \h </w:instrText>
             </w:r>
             <w:r>
               <w:rPr>
@@ -343,7 +343,7 @@
               <w14:ligatures w14:val="standardContextual"/>
             </w:rPr>
           </w:pPr>
-          <w:hyperlink w:anchor="_Toc207009771" w:history="1">
+          <w:hyperlink w:anchor="_Toc207087289" w:history="1">
             <w:r>
               <w:rPr>
                 <w:rStyle w:val="Hyperlink"/>
@@ -370,7 +370,7 @@
                 <w:noProof/>
                 <w:webHidden/>
               </w:rPr>
-              <w:instrText xml:space="preserve"> PAGEREF _Toc207009771 \h </w:instrText>
+              <w:instrText xml:space="preserve"> PAGEREF _Toc207087289 \h </w:instrText>
             </w:r>
             <w:r>
               <w:rPr>
@@ -418,7 +418,7 @@
               <w14:ligatures w14:val="standardContextual"/>
             </w:rPr>
           </w:pPr>
-          <w:hyperlink w:anchor="_Toc207009772" w:history="1">
+          <w:hyperlink w:anchor="_Toc207087290" w:history="1">
             <w:r>
               <w:rPr>
                 <w:rStyle w:val="Hyperlink"/>
@@ -445,7 +445,7 @@
                 <w:noProof/>
                 <w:webHidden/>
               </w:rPr>
-              <w:instrText xml:space="preserve"> PAGEREF _Toc207009772 \h </w:instrText>
+              <w:instrText xml:space="preserve"> PAGEREF _Toc207087290 \h </w:instrText>
             </w:r>
             <w:r>
               <w:rPr>
@@ -493,7 +493,7 @@
               <w14:ligatures w14:val="standardContextual"/>
             </w:rPr>
           </w:pPr>
-          <w:hyperlink w:anchor="_Toc207009773" w:history="1">
+          <w:hyperlink w:anchor="_Toc207087291" w:history="1">
             <w:r>
               <w:rPr>
                 <w:rStyle w:val="Hyperlink"/>
@@ -520,7 +520,7 @@
                 <w:noProof/>
                 <w:webHidden/>
               </w:rPr>
-              <w:instrText xml:space="preserve"> PAGEREF _Toc207009773 \h </w:instrText>
+              <w:instrText xml:space="preserve"> PAGEREF _Toc207087291 \h </w:instrText>
             </w:r>
             <w:r>
               <w:rPr>
@@ -568,7 +568,7 @@
               <w14:ligatures w14:val="standardContextual"/>
             </w:rPr>
           </w:pPr>
-          <w:hyperlink w:anchor="_Toc207009774" w:history="1">
+          <w:hyperlink w:anchor="_Toc207087292" w:history="1">
             <w:r>
               <w:rPr>
                 <w:rStyle w:val="Hyperlink"/>
@@ -595,7 +595,7 @@
                 <w:noProof/>
                 <w:webHidden/>
               </w:rPr>
-              <w:instrText xml:space="preserve"> PAGEREF _Toc207009774 \h </w:instrText>
+              <w:instrText xml:space="preserve"> PAGEREF _Toc207087292 \h </w:instrText>
             </w:r>
             <w:r>
               <w:rPr>
@@ -643,7 +643,7 @@
               <w14:ligatures w14:val="standardContextual"/>
             </w:rPr>
           </w:pPr>
-          <w:hyperlink w:anchor="_Toc207009775" w:history="1">
+          <w:hyperlink w:anchor="_Toc207087293" w:history="1">
             <w:r>
               <w:rPr>
                 <w:rStyle w:val="Hyperlink"/>
@@ -670,7 +670,7 @@
                 <w:noProof/>
                 <w:webHidden/>
               </w:rPr>
-              <w:instrText xml:space="preserve"> PAGEREF _Toc207009775 \h </w:instrText>
+              <w:instrText xml:space="preserve"> PAGEREF _Toc207087293 \h </w:instrText>
             </w:r>
             <w:r>
               <w:rPr>
@@ -718,7 +718,7 @@
               <w14:ligatures w14:val="standardContextual"/>
             </w:rPr>
           </w:pPr>
-          <w:hyperlink w:anchor="_Toc207009776" w:history="1">
+          <w:hyperlink w:anchor="_Toc207087294" w:history="1">
             <w:r>
               <w:rPr>
                 <w:rStyle w:val="Hyperlink"/>
@@ -745,7 +745,7 @@
                 <w:noProof/>
                 <w:webHidden/>
               </w:rPr>
-              <w:instrText xml:space="preserve"> PAGEREF _Toc207009776 \h </w:instrText>
+              <w:instrText xml:space="preserve"> PAGEREF _Toc207087294 \h </w:instrText>
             </w:r>
             <w:r>
               <w:rPr>
@@ -793,7 +793,7 @@
               <w14:ligatures w14:val="standardContextual"/>
             </w:rPr>
           </w:pPr>
-          <w:hyperlink w:anchor="_Toc207009777" w:history="1">
+          <w:hyperlink w:anchor="_Toc207087295" w:history="1">
             <w:r>
               <w:rPr>
                 <w:rStyle w:val="Hyperlink"/>
@@ -820,7 +820,7 @@
                 <w:noProof/>
                 <w:webHidden/>
               </w:rPr>
-              <w:instrText xml:space="preserve"> PAGEREF _Toc207009777 \h </w:instrText>
+              <w:instrText xml:space="preserve"> PAGEREF _Toc207087295 \h </w:instrText>
             </w:r>
             <w:r>
               <w:rPr>
@@ -868,7 +868,7 @@
               <w14:ligatures w14:val="standardContextual"/>
             </w:rPr>
           </w:pPr>
-          <w:hyperlink w:anchor="_Toc207009778" w:history="1">
+          <w:hyperlink w:anchor="_Toc207087296" w:history="1">
             <w:r>
               <w:rPr>
                 <w:rStyle w:val="Hyperlink"/>
@@ -895,7 +895,7 @@
                 <w:noProof/>
                 <w:webHidden/>
               </w:rPr>
-              <w:instrText xml:space="preserve"> PAGEREF _Toc207009778 \h </w:instrText>
+              <w:instrText xml:space="preserve"> PAGEREF _Toc207087296 \h </w:instrText>
             </w:r>
             <w:r>
               <w:rPr>
@@ -941,7 +941,7 @@
               <w14:ligatures w14:val="standardContextual"/>
             </w:rPr>
           </w:pPr>
-          <w:hyperlink w:anchor="_Toc207009779" w:history="1">
+          <w:hyperlink w:anchor="_Toc207087297" w:history="1">
             <w:r>
               <w:rPr>
                 <w:rStyle w:val="Hyperlink"/>
@@ -968,7 +968,7 @@
                 <w:noProof/>
                 <w:webHidden/>
               </w:rPr>
-              <w:instrText xml:space="preserve"> PAGEREF _Toc207009779 \h </w:instrText>
+              <w:instrText xml:space="preserve"> PAGEREF _Toc207087297 \h </w:instrText>
             </w:r>
             <w:r>
               <w:rPr>
@@ -1014,7 +1014,7 @@
               <w14:ligatures w14:val="standardContextual"/>
             </w:rPr>
           </w:pPr>
-          <w:hyperlink w:anchor="_Toc207009780" w:history="1">
+          <w:hyperlink w:anchor="_Toc207087298" w:history="1">
             <w:r>
               <w:rPr>
                 <w:rStyle w:val="Hyperlink"/>
@@ -1041,7 +1041,7 @@
                 <w:noProof/>
                 <w:webHidden/>
               </w:rPr>
-              <w:instrText xml:space="preserve"> PAGEREF _Toc207009780 \h </w:instrText>
+              <w:instrText xml:space="preserve"> PAGEREF _Toc207087298 \h </w:instrText>
             </w:r>
             <w:r>
               <w:rPr>
@@ -1087,7 +1087,7 @@
               <w14:ligatures w14:val="standardContextual"/>
             </w:rPr>
           </w:pPr>
-          <w:hyperlink w:anchor="_Toc207009781" w:history="1">
+          <w:hyperlink w:anchor="_Toc207087299" w:history="1">
             <w:r>
               <w:rPr>
                 <w:rStyle w:val="Hyperlink"/>
@@ -1114,7 +1114,7 @@
                 <w:noProof/>
                 <w:webHidden/>
               </w:rPr>
-              <w:instrText xml:space="preserve"> PAGEREF _Toc207009781 \h </w:instrText>
+              <w:instrText xml:space="preserve"> PAGEREF _Toc207087299 \h </w:instrText>
             </w:r>
             <w:r>
               <w:rPr>
@@ -1160,7 +1160,7 @@
               <w14:ligatures w14:val="standardContextual"/>
             </w:rPr>
           </w:pPr>
-          <w:hyperlink w:anchor="_Toc207009782" w:history="1">
+          <w:hyperlink w:anchor="_Toc207087300" w:history="1">
             <w:r>
               <w:rPr>
                 <w:rStyle w:val="Hyperlink"/>
@@ -1187,7 +1187,7 @@
                 <w:noProof/>
                 <w:webHidden/>
               </w:rPr>
-              <w:instrText xml:space="preserve"> PAGEREF _Toc207009782 \h </w:instrText>
+              <w:instrText xml:space="preserve"> PAGEREF _Toc207087300 \h </w:instrText>
             </w:r>
             <w:r>
               <w:rPr>
@@ -1235,7 +1235,7 @@
               <w14:ligatures w14:val="standardContextual"/>
             </w:rPr>
           </w:pPr>
-          <w:hyperlink w:anchor="_Toc207009783" w:history="1">
+          <w:hyperlink w:anchor="_Toc207087301" w:history="1">
             <w:r>
               <w:rPr>
                 <w:rStyle w:val="Hyperlink"/>
@@ -1262,7 +1262,7 @@
                 <w:noProof/>
                 <w:webHidden/>
               </w:rPr>
-              <w:instrText xml:space="preserve"> PAGEREF _Toc207009783 \h </w:instrText>
+              <w:instrText xml:space="preserve"> PAGEREF _Toc207087301 \h </w:instrText>
             </w:r>
             <w:r>
               <w:rPr>
@@ -1308,7 +1308,7 @@
               <w14:ligatures w14:val="standardContextual"/>
             </w:rPr>
           </w:pPr>
-          <w:hyperlink w:anchor="_Toc207009784" w:history="1">
+          <w:hyperlink w:anchor="_Toc207087302" w:history="1">
             <w:r>
               <w:rPr>
                 <w:rStyle w:val="Hyperlink"/>
@@ -1335,7 +1335,7 @@
                 <w:noProof/>
                 <w:webHidden/>
               </w:rPr>
-              <w:instrText xml:space="preserve"> PAGEREF _Toc207009784 \h </w:instrText>
+              <w:instrText xml:space="preserve"> PAGEREF _Toc207087302 \h </w:instrText>
             </w:r>
             <w:r>
               <w:rPr>
@@ -1381,7 +1381,7 @@
               <w14:ligatures w14:val="standardContextual"/>
             </w:rPr>
           </w:pPr>
-          <w:hyperlink w:anchor="_Toc207009785" w:history="1">
+          <w:hyperlink w:anchor="_Toc207087303" w:history="1">
             <w:r>
               <w:rPr>
                 <w:rStyle w:val="Hyperlink"/>
@@ -1408,7 +1408,7 @@
                 <w:noProof/>
                 <w:webHidden/>
               </w:rPr>
-              <w:instrText xml:space="preserve"> PAGEREF _Toc207009785 \h </w:instrText>
+              <w:instrText xml:space="preserve"> PAGEREF _Toc207087303 \h </w:instrText>
             </w:r>
             <w:r>
               <w:rPr>
@@ -1454,7 +1454,7 @@
               <w14:ligatures w14:val="standardContextual"/>
             </w:rPr>
           </w:pPr>
-          <w:hyperlink w:anchor="_Toc207009786" w:history="1">
+          <w:hyperlink w:anchor="_Toc207087304" w:history="1">
             <w:r>
               <w:rPr>
                 <w:rStyle w:val="Hyperlink"/>
@@ -1481,7 +1481,7 @@
                 <w:noProof/>
                 <w:webHidden/>
               </w:rPr>
-              <w:instrText xml:space="preserve"> PAGEREF _Toc207009786 \h </w:instrText>
+              <w:instrText xml:space="preserve"> PAGEREF _Toc207087304 \h </w:instrText>
             </w:r>
             <w:r>
               <w:rPr>
@@ -1527,7 +1527,7 @@
               <w14:ligatures w14:val="standardContextual"/>
             </w:rPr>
           </w:pPr>
-          <w:hyperlink w:anchor="_Toc207009787" w:history="1">
+          <w:hyperlink w:anchor="_Toc207087305" w:history="1">
             <w:r>
               <w:rPr>
                 <w:rStyle w:val="Hyperlink"/>
@@ -1554,7 +1554,7 @@
                 <w:noProof/>
                 <w:webHidden/>
               </w:rPr>
-              <w:instrText xml:space="preserve"> PAGEREF _Toc207009787 \h </w:instrText>
+              <w:instrText xml:space="preserve"> PAGEREF _Toc207087305 \h </w:instrText>
             </w:r>
             <w:r>
               <w:rPr>
@@ -1602,7 +1602,7 @@
               <w14:ligatures w14:val="standardContextual"/>
             </w:rPr>
           </w:pPr>
-          <w:hyperlink w:anchor="_Toc207009788" w:history="1">
+          <w:hyperlink w:anchor="_Toc207087306" w:history="1">
             <w:r>
               <w:rPr>
                 <w:rStyle w:val="Hyperlink"/>
@@ -1629,7 +1629,7 @@
                 <w:noProof/>
                 <w:webHidden/>
               </w:rPr>
-              <w:instrText xml:space="preserve"> PAGEREF _Toc207009788 \h </w:instrText>
+              <w:instrText xml:space="preserve"> PAGEREF _Toc207087306 \h </w:instrText>
             </w:r>
             <w:r>
               <w:rPr>
@@ -1677,7 +1677,7 @@
               <w14:ligatures w14:val="standardContextual"/>
             </w:rPr>
           </w:pPr>
-          <w:hyperlink w:anchor="_Toc207009789" w:history="1">
+          <w:hyperlink w:anchor="_Toc207087307" w:history="1">
             <w:r>
               <w:rPr>
                 <w:rStyle w:val="Hyperlink"/>
@@ -1704,7 +1704,7 @@
                 <w:noProof/>
                 <w:webHidden/>
               </w:rPr>
-              <w:instrText xml:space="preserve"> PAGEREF _Toc207009789 \h </w:instrText>
+              <w:instrText xml:space="preserve"> PAGEREF _Toc207087307 \h </w:instrText>
             </w:r>
             <w:r>
               <w:rPr>
@@ -1752,7 +1752,7 @@
               <w14:ligatures w14:val="standardContextual"/>
             </w:rPr>
           </w:pPr>
-          <w:hyperlink w:anchor="_Toc207009790" w:history="1">
+          <w:hyperlink w:anchor="_Toc207087308" w:history="1">
             <w:r>
               <w:rPr>
                 <w:rStyle w:val="Hyperlink"/>
@@ -1779,7 +1779,7 @@
                 <w:noProof/>
                 <w:webHidden/>
               </w:rPr>
-              <w:instrText xml:space="preserve"> PAGEREF _Toc207009790 \h </w:instrText>
+              <w:instrText xml:space="preserve"> PAGEREF _Toc207087308 \h </w:instrText>
             </w:r>
             <w:r>
               <w:rPr>
@@ -1827,7 +1827,7 @@
               <w14:ligatures w14:val="standardContextual"/>
             </w:rPr>
           </w:pPr>
-          <w:hyperlink w:anchor="_Toc207009791" w:history="1">
+          <w:hyperlink w:anchor="_Toc207087309" w:history="1">
             <w:r>
               <w:rPr>
                 <w:rStyle w:val="Hyperlink"/>
@@ -1854,7 +1854,7 @@
                 <w:noProof/>
                 <w:webHidden/>
               </w:rPr>
-              <w:instrText xml:space="preserve"> PAGEREF _Toc207009791 \h </w:instrText>
+              <w:instrText xml:space="preserve"> PAGEREF _Toc207087309 \h </w:instrText>
             </w:r>
             <w:r>
               <w:rPr>
@@ -1902,7 +1902,7 @@
               <w14:ligatures w14:val="standardContextual"/>
             </w:rPr>
           </w:pPr>
-          <w:hyperlink w:anchor="_Toc207009792" w:history="1">
+          <w:hyperlink w:anchor="_Toc207087310" w:history="1">
             <w:r>
               <w:rPr>
                 <w:rStyle w:val="Hyperlink"/>
@@ -1929,7 +1929,7 @@
                 <w:noProof/>
                 <w:webHidden/>
               </w:rPr>
-              <w:instrText xml:space="preserve"> PAGEREF _Toc207009792 \h </w:instrText>
+              <w:instrText xml:space="preserve"> PAGEREF _Toc207087310 \h </w:instrText>
             </w:r>
             <w:r>
               <w:rPr>
@@ -1977,7 +1977,7 @@
               <w14:ligatures w14:val="standardContextual"/>
             </w:rPr>
           </w:pPr>
-          <w:hyperlink w:anchor="_Toc207009793" w:history="1">
+          <w:hyperlink w:anchor="_Toc207087311" w:history="1">
             <w:r>
               <w:rPr>
                 <w:rStyle w:val="Hyperlink"/>
@@ -2004,7 +2004,7 @@
                 <w:noProof/>
                 <w:webHidden/>
               </w:rPr>
-              <w:instrText xml:space="preserve"> PAGEREF _Toc207009793 \h </w:instrText>
+              <w:instrText xml:space="preserve"> PAGEREF _Toc207087311 \h </w:instrText>
             </w:r>
             <w:r>
               <w:rPr>
@@ -2052,7 +2052,7 @@
               <w14:ligatures w14:val="standardContextual"/>
             </w:rPr>
           </w:pPr>
-          <w:hyperlink w:anchor="_Toc207009794" w:history="1">
+          <w:hyperlink w:anchor="_Toc207087312" w:history="1">
             <w:r>
               <w:rPr>
                 <w:rStyle w:val="Hyperlink"/>
@@ -2079,7 +2079,7 @@
                 <w:noProof/>
                 <w:webHidden/>
               </w:rPr>
-              <w:instrText xml:space="preserve"> PAGEREF _Toc207009794 \h </w:instrText>
+              <w:instrText xml:space="preserve"> PAGEREF _Toc207087312 \h </w:instrText>
             </w:r>
             <w:r>
               <w:rPr>
@@ -2127,7 +2127,7 @@
               <w14:ligatures w14:val="standardContextual"/>
             </w:rPr>
           </w:pPr>
-          <w:hyperlink w:anchor="_Toc207009795" w:history="1">
+          <w:hyperlink w:anchor="_Toc207087313" w:history="1">
             <w:r>
               <w:rPr>
                 <w:rStyle w:val="Hyperlink"/>
@@ -2154,7 +2154,7 @@
                 <w:noProof/>
                 <w:webHidden/>
               </w:rPr>
-              <w:instrText xml:space="preserve"> PAGEREF _Toc207009795 \h </w:instrText>
+              <w:instrText xml:space="preserve"> PAGEREF _Toc207087313 \h </w:instrText>
             </w:r>
             <w:r>
               <w:rPr>
@@ -2202,7 +2202,7 @@
               <w14:ligatures w14:val="standardContextual"/>
             </w:rPr>
           </w:pPr>
-          <w:hyperlink w:anchor="_Toc207009796" w:history="1">
+          <w:hyperlink w:anchor="_Toc207087314" w:history="1">
             <w:r>
               <w:rPr>
                 <w:rStyle w:val="Hyperlink"/>
@@ -2229,7 +2229,7 @@
                 <w:noProof/>
                 <w:webHidden/>
               </w:rPr>
-              <w:instrText xml:space="preserve"> PAGEREF _Toc207009796 \h </w:instrText>
+              <w:instrText xml:space="preserve"> PAGEREF _Toc207087314 \h </w:instrText>
             </w:r>
             <w:r>
               <w:rPr>
@@ -2277,7 +2277,7 @@
               <w14:ligatures w14:val="standardContextual"/>
             </w:rPr>
           </w:pPr>
-          <w:hyperlink w:anchor="_Toc207009797" w:history="1">
+          <w:hyperlink w:anchor="_Toc207087315" w:history="1">
             <w:r>
               <w:rPr>
                 <w:rStyle w:val="Hyperlink"/>
@@ -2304,7 +2304,7 @@
                 <w:noProof/>
                 <w:webHidden/>
               </w:rPr>
-              <w:instrText xml:space="preserve"> PAGEREF _Toc207009797 \h </w:instrText>
+              <w:instrText xml:space="preserve"> PAGEREF _Toc207087315 \h </w:instrText>
             </w:r>
             <w:r>
               <w:rPr>
@@ -2352,7 +2352,7 @@
               <w14:ligatures w14:val="standardContextual"/>
             </w:rPr>
           </w:pPr>
-          <w:hyperlink w:anchor="_Toc207009798" w:history="1">
+          <w:hyperlink w:anchor="_Toc207087316" w:history="1">
             <w:r>
               <w:rPr>
                 <w:rStyle w:val="Hyperlink"/>
@@ -2379,7 +2379,7 @@
                 <w:noProof/>
                 <w:webHidden/>
               </w:rPr>
-              <w:instrText xml:space="preserve"> PAGEREF _Toc207009798 \h </w:instrText>
+              <w:instrText xml:space="preserve"> PAGEREF _Toc207087316 \h </w:instrText>
             </w:r>
             <w:r>
               <w:rPr>
@@ -2427,7 +2427,7 @@
               <w14:ligatures w14:val="standardContextual"/>
             </w:rPr>
           </w:pPr>
-          <w:hyperlink w:anchor="_Toc207009799" w:history="1">
+          <w:hyperlink w:anchor="_Toc207087317" w:history="1">
             <w:r>
               <w:rPr>
                 <w:rStyle w:val="Hyperlink"/>
@@ -2454,7 +2454,7 @@
                 <w:noProof/>
                 <w:webHidden/>
               </w:rPr>
-              <w:instrText xml:space="preserve"> PAGEREF _Toc207009799 \h </w:instrText>
+              <w:instrText xml:space="preserve"> PAGEREF _Toc207087317 \h </w:instrText>
             </w:r>
             <w:r>
               <w:rPr>
@@ -2502,7 +2502,7 @@
               <w14:ligatures w14:val="standardContextual"/>
             </w:rPr>
           </w:pPr>
-          <w:hyperlink w:anchor="_Toc207009800" w:history="1">
+          <w:hyperlink w:anchor="_Toc207087318" w:history="1">
             <w:r>
               <w:rPr>
                 <w:rStyle w:val="Hyperlink"/>
@@ -2529,7 +2529,7 @@
                 <w:noProof/>
                 <w:webHidden/>
               </w:rPr>
-              <w:instrText xml:space="preserve"> PAGEREF _Toc207009800 \h </w:instrText>
+              <w:instrText xml:space="preserve"> PAGEREF _Toc207087318 \h </w:instrText>
             </w:r>
             <w:r>
               <w:rPr>
@@ -2577,7 +2577,7 @@
               <w14:ligatures w14:val="standardContextual"/>
             </w:rPr>
           </w:pPr>
-          <w:hyperlink w:anchor="_Toc207009801" w:history="1">
+          <w:hyperlink w:anchor="_Toc207087319" w:history="1">
             <w:r>
               <w:rPr>
                 <w:rStyle w:val="Hyperlink"/>
@@ -2604,7 +2604,7 @@
                 <w:noProof/>
                 <w:webHidden/>
               </w:rPr>
-              <w:instrText xml:space="preserve"> PAGEREF _Toc207009801 \h </w:instrText>
+              <w:instrText xml:space="preserve"> PAGEREF _Toc207087319 \h </w:instrText>
             </w:r>
             <w:r>
               <w:rPr>
@@ -2651,7 +2651,7 @@
       <w:pPr>
         <w:pStyle w:val="Heading1"/>
       </w:pPr>
-      <w:bookmarkStart w:id="1" w:name="_Toc207009768"/>
+      <w:bookmarkStart w:id="1" w:name="_Toc207087286"/>
       <w:r>
         <w:t xml:space="preserve">(I) </w:t>
       </w:r>
@@ -2975,14 +2975,7 @@
         <w:rPr>
           <w:rFonts w:ascii="Arial" w:hAnsi="Arial" w:cs="Arial"/>
         </w:rPr>
-        <w:t xml:space="preserve">detectable proteins and </w:t>
-      </w:r>
-      <w:r>
-        <w:rPr>
-          <w:rFonts w:ascii="Arial" w:hAnsi="Arial" w:cs="Arial"/>
-        </w:rPr>
-        <w:lastRenderedPageBreak/>
-        <w:t>validated nine breast cancer biomarkers with ROC AUC ~0.91 in clinical serum/plasma samples (</w:t>
+        <w:t>detectable proteins and validated nine breast cancer biomarkers with ROC AUC ~0.91 in clinical serum/plasma samples (</w:t>
       </w:r>
       <w:hyperlink r:id="rId10">
         <w:r>
@@ -3171,16 +3164,37 @@
     </w:p>
     <w:p>
       <w:pPr>
+        <w:pStyle w:val="Heading1"/>
+      </w:pPr>
+      <w:bookmarkStart w:id="2" w:name="i-1-top-down-vs.-bottom-up-proteomics"/>
+      <w:bookmarkStart w:id="3" w:name="_Toc207087287"/>
+      <w:r>
+        <w:t>(</w:t>
+      </w:r>
+      <w:r>
+        <w:t>I</w:t>
+      </w:r>
+      <w:r>
+        <w:t>I</w:t>
+      </w:r>
+      <w:r>
+        <w:t>) Top-Down vs. Bottom-Up Proteomics</w:t>
+      </w:r>
+      <w:bookmarkEnd w:id="3"/>
+    </w:p>
+    <w:p>
+      <w:pPr>
         <w:pStyle w:val="FirstParagraph"/>
-        <w:rPr>
-          <w:rFonts w:ascii="Arial" w:hAnsi="Arial" w:cs="Arial"/>
-        </w:rPr>
-      </w:pPr>
-      <w:r>
-        <w:rPr>
-          <w:rFonts w:ascii="Arial" w:hAnsi="Arial" w:cs="Arial"/>
-        </w:rPr>
-        <w:t xml:space="preserve">Would you like to include any </w:t>
+        <w:jc w:val="both"/>
+        <w:rPr>
+          <w:rFonts w:ascii="Arial" w:hAnsi="Arial" w:cs="Arial"/>
+        </w:rPr>
+      </w:pPr>
+      <w:r>
+        <w:rPr>
+          <w:rFonts w:ascii="Arial" w:hAnsi="Arial" w:cs="Arial"/>
+        </w:rPr>
+        <w:t xml:space="preserve">Mass spectrometry-based proteomics can be broadly divided into </w:t>
       </w:r>
       <w:r>
         <w:rPr>
@@ -3188,48 +3202,13 @@
           <w:i/>
           <w:iCs/>
         </w:rPr>
-        <w:t>Science</w:t>
-      </w:r>
-      <w:r>
-        <w:rPr>
-          <w:rFonts w:ascii="Arial" w:hAnsi="Arial" w:cs="Arial"/>
-        </w:rPr>
-        <w:t xml:space="preserve"> journal examples or expand this list with applications such as clinical biomarker discovery or PTM mapping?</w:t>
-      </w:r>
-    </w:p>
-    <w:p>
-      <w:pPr>
-        <w:pStyle w:val="Heading1"/>
-      </w:pPr>
-      <w:bookmarkStart w:id="2" w:name="i-1-top-down-vs.-bottom-up-proteomics"/>
-      <w:bookmarkStart w:id="3" w:name="_Toc207009769"/>
-      <w:r>
-        <w:t>(</w:t>
-      </w:r>
-      <w:r>
-        <w:t>I</w:t>
-      </w:r>
-      <w:r>
-        <w:t>I</w:t>
-      </w:r>
-      <w:r>
-        <w:t>) Top-Down vs. Bottom-Up Proteomics</w:t>
-      </w:r>
-      <w:bookmarkEnd w:id="3"/>
-    </w:p>
-    <w:p>
-      <w:pPr>
-        <w:pStyle w:val="FirstParagraph"/>
-        <w:jc w:val="both"/>
-        <w:rPr>
-          <w:rFonts w:ascii="Arial" w:hAnsi="Arial" w:cs="Arial"/>
-        </w:rPr>
-      </w:pPr>
-      <w:r>
-        <w:rPr>
-          <w:rFonts w:ascii="Arial" w:hAnsi="Arial" w:cs="Arial"/>
-        </w:rPr>
-        <w:t xml:space="preserve">Mass spectrometry-based proteomics can be broadly divided into </w:t>
+        <w:t>bottom-up</w:t>
+      </w:r>
+      <w:r>
+        <w:rPr>
+          <w:rFonts w:ascii="Arial" w:hAnsi="Arial" w:cs="Arial"/>
+        </w:rPr>
+        <w:t xml:space="preserve"> and </w:t>
       </w:r>
       <w:r>
         <w:rPr>
@@ -3237,20 +3216,6 @@
           <w:i/>
           <w:iCs/>
         </w:rPr>
-        <w:t>bottom-up</w:t>
-      </w:r>
-      <w:r>
-        <w:rPr>
-          <w:rFonts w:ascii="Arial" w:hAnsi="Arial" w:cs="Arial"/>
-        </w:rPr>
-        <w:t xml:space="preserve"> and </w:t>
-      </w:r>
-      <w:r>
-        <w:rPr>
-          <w:rFonts w:ascii="Arial" w:hAnsi="Arial" w:cs="Arial"/>
-          <w:i/>
-          <w:iCs/>
-        </w:rPr>
         <w:t>top-down</w:t>
       </w:r>
       <w:r>
@@ -3272,6 +3237,7 @@
         <w:rPr>
           <w:rFonts w:ascii="Arial" w:hAnsi="Arial" w:cs="Arial"/>
         </w:rPr>
+        <w:lastRenderedPageBreak/>
         <w:br/>
       </w:r>
       <w:r>
@@ -3336,7 +3302,7 @@
         <w:pStyle w:val="Heading2"/>
       </w:pPr>
       <w:bookmarkStart w:id="4" w:name="bottom-up-proteomics-bup"/>
-      <w:bookmarkStart w:id="5" w:name="_Toc207009770"/>
+      <w:bookmarkStart w:id="5" w:name="_Toc207087288"/>
       <w:r>
         <w:t xml:space="preserve">Bottom-Up </w:t>
       </w:r>
@@ -3589,7 +3555,7 @@
         <w:pStyle w:val="Heading2"/>
       </w:pPr>
       <w:bookmarkStart w:id="6" w:name="top-down-proteomics-tdp"/>
-      <w:bookmarkStart w:id="7" w:name="_Toc207009771"/>
+      <w:bookmarkStart w:id="7" w:name="_Toc207087289"/>
       <w:bookmarkEnd w:id="4"/>
       <w:r>
         <w:t xml:space="preserve">Top-Down </w:t>
@@ -3777,6 +3743,7 @@
         <w:rPr>
           <w:rFonts w:ascii="Arial" w:hAnsi="Arial" w:cs="Arial"/>
         </w:rPr>
+        <w:lastRenderedPageBreak/>
         <w:t>Lower throughput and dynamic range.</w:t>
       </w:r>
     </w:p>
@@ -3823,7 +3790,7 @@
         <w:pStyle w:val="Heading1"/>
       </w:pPr>
       <w:bookmarkStart w:id="8" w:name="Xba20cece1ffc625549b3429010631dbbf775f3a"/>
-      <w:bookmarkStart w:id="9" w:name="_Toc207009772"/>
+      <w:bookmarkStart w:id="9" w:name="_Toc207087290"/>
       <w:bookmarkEnd w:id="2"/>
       <w:bookmarkEnd w:id="6"/>
       <w:r>
@@ -3918,7 +3885,7 @@
       <w:pPr>
         <w:pStyle w:val="Heading2"/>
       </w:pPr>
-      <w:bookmarkStart w:id="10" w:name="_Toc207009773"/>
+      <w:bookmarkStart w:id="10" w:name="_Toc207087291"/>
       <w:r>
         <w:t>Ion Source</w:t>
       </w:r>
@@ -4012,7 +3979,7 @@
       <w:pPr>
         <w:pStyle w:val="Heading2"/>
       </w:pPr>
-      <w:bookmarkStart w:id="11" w:name="_Toc207009774"/>
+      <w:bookmarkStart w:id="11" w:name="_Toc207087292"/>
       <w:r>
         <w:t>Mass Analyzer</w:t>
       </w:r>
@@ -4163,7 +4130,7 @@
       <w:pPr>
         <w:pStyle w:val="Heading2"/>
       </w:pPr>
-      <w:bookmarkStart w:id="12" w:name="_Toc207009775"/>
+      <w:bookmarkStart w:id="12" w:name="_Toc207087293"/>
       <w:r>
         <w:t>Detector</w:t>
       </w:r>
@@ -4203,8 +4170,9 @@
       <w:pPr>
         <w:pStyle w:val="Heading2"/>
       </w:pPr>
-      <w:bookmarkStart w:id="13" w:name="_Toc207009776"/>
-      <w:r>
+      <w:bookmarkStart w:id="13" w:name="_Toc207087294"/>
+      <w:r>
+        <w:lastRenderedPageBreak/>
         <w:t>Tandem MS (MS/MS)</w:t>
       </w:r>
       <w:bookmarkEnd w:id="13"/>
@@ -4255,7 +4223,7 @@
         <w:pStyle w:val="Heading1"/>
       </w:pPr>
       <w:bookmarkStart w:id="14" w:name="Xcb5b17e175c0680b1832c967f19bd40bd9a292f"/>
-      <w:bookmarkStart w:id="15" w:name="_Toc207009777"/>
+      <w:bookmarkStart w:id="15" w:name="_Toc207087295"/>
       <w:bookmarkEnd w:id="8"/>
       <w:r>
         <w:t>(I</w:t>
@@ -4346,7 +4314,7 @@
       <w:pPr>
         <w:pStyle w:val="Heading2"/>
       </w:pPr>
-      <w:bookmarkStart w:id="16" w:name="_Toc207009778"/>
+      <w:bookmarkStart w:id="16" w:name="_Toc207087296"/>
       <w:r>
         <w:t xml:space="preserve">General </w:t>
       </w:r>
@@ -4359,7 +4327,7 @@
       <w:pPr>
         <w:pStyle w:val="Heading3"/>
       </w:pPr>
-      <w:bookmarkStart w:id="17" w:name="_Toc207009779"/>
+      <w:bookmarkStart w:id="17" w:name="_Toc207087297"/>
       <w:r>
         <w:t>Protein Extraction and Digestion</w:t>
       </w:r>
@@ -4399,7 +4367,7 @@
       <w:pPr>
         <w:pStyle w:val="Heading3"/>
       </w:pPr>
-      <w:bookmarkStart w:id="18" w:name="_Toc207009780"/>
+      <w:bookmarkStart w:id="18" w:name="_Toc207087298"/>
       <w:r>
         <w:t>Peptide Separation</w:t>
       </w:r>
@@ -4439,7 +4407,7 @@
       <w:pPr>
         <w:pStyle w:val="Heading3"/>
       </w:pPr>
-      <w:bookmarkStart w:id="19" w:name="_Toc207009781"/>
+      <w:bookmarkStart w:id="19" w:name="_Toc207087299"/>
       <w:r>
         <w:t>Mass Spectrometry Analysis</w:t>
       </w:r>
@@ -4493,7 +4461,7 @@
       <w:pPr>
         <w:pStyle w:val="Heading3"/>
       </w:pPr>
-      <w:bookmarkStart w:id="20" w:name="_Toc207009782"/>
+      <w:bookmarkStart w:id="20" w:name="_Toc207087300"/>
       <w:r>
         <w:t>Data Interpretation</w:t>
       </w:r>
@@ -4586,9 +4554,10 @@
         <w:pStyle w:val="Heading2"/>
       </w:pPr>
       <w:bookmarkStart w:id="21" w:name="i-4-biophysical-principles-at-work"/>
-      <w:bookmarkStart w:id="22" w:name="_Toc207009783"/>
+      <w:bookmarkStart w:id="22" w:name="_Toc207087301"/>
       <w:bookmarkEnd w:id="14"/>
       <w:r>
+        <w:lastRenderedPageBreak/>
         <w:t>Biophysical Principles at Work</w:t>
       </w:r>
       <w:bookmarkEnd w:id="22"/>
@@ -4597,7 +4566,7 @@
       <w:pPr>
         <w:pStyle w:val="Heading3"/>
       </w:pPr>
-      <w:bookmarkStart w:id="23" w:name="_Toc207009784"/>
+      <w:bookmarkStart w:id="23" w:name="_Toc207087302"/>
       <w:r>
         <w:t>Ionization Efficiency</w:t>
       </w:r>
@@ -4620,9 +4589,8 @@
       <w:pPr>
         <w:pStyle w:val="Heading3"/>
       </w:pPr>
-      <w:bookmarkStart w:id="24" w:name="_Toc207009785"/>
-      <w:r>
-        <w:lastRenderedPageBreak/>
+      <w:bookmarkStart w:id="24" w:name="_Toc207087303"/>
+      <w:r>
         <w:t>Mass Resolution</w:t>
       </w:r>
       <w:bookmarkEnd w:id="24"/>
@@ -4647,7 +4615,7 @@
       <w:pPr>
         <w:pStyle w:val="Heading3"/>
       </w:pPr>
-      <w:bookmarkStart w:id="25" w:name="_Toc207009786"/>
+      <w:bookmarkStart w:id="25" w:name="_Toc207087304"/>
       <w:r>
         <w:t>Fragmentation Patterns</w:t>
       </w:r>
@@ -4684,7 +4652,7 @@
       <w:pPr>
         <w:pStyle w:val="Heading3"/>
       </w:pPr>
-      <w:bookmarkStart w:id="26" w:name="_Toc207009787"/>
+      <w:bookmarkStart w:id="26" w:name="_Toc207087305"/>
       <w:r>
         <w:t>Quantification</w:t>
       </w:r>
@@ -4760,7 +4728,7 @@
         <w:pStyle w:val="Heading1"/>
       </w:pPr>
       <w:bookmarkStart w:id="27" w:name="Xa376ba76a588a6a500ad2932a58db6fdc745291"/>
-      <w:bookmarkStart w:id="28" w:name="_Toc207009788"/>
+      <w:bookmarkStart w:id="28" w:name="_Toc207087306"/>
       <w:bookmarkEnd w:id="21"/>
       <w:r>
         <w:t>(</w:t>
@@ -4799,7 +4767,7 @@
         <w:pStyle w:val="Heading2"/>
       </w:pPr>
       <w:bookmarkStart w:id="29" w:name="sensitivity"/>
-      <w:bookmarkStart w:id="30" w:name="_Toc207009789"/>
+      <w:bookmarkStart w:id="30" w:name="_Toc207087307"/>
       <w:r>
         <w:t>Sensitivity</w:t>
       </w:r>
@@ -4837,7 +4805,7 @@
         <w:pStyle w:val="Heading2"/>
       </w:pPr>
       <w:bookmarkStart w:id="31" w:name="specificity"/>
-      <w:bookmarkStart w:id="32" w:name="_Toc207009790"/>
+      <w:bookmarkStart w:id="32" w:name="_Toc207087308"/>
       <w:bookmarkEnd w:id="29"/>
       <w:r>
         <w:t>Specificity</w:t>
@@ -4927,7 +4895,7 @@
         <w:pStyle w:val="Heading2"/>
       </w:pPr>
       <w:bookmarkStart w:id="33" w:name="throughput"/>
-      <w:bookmarkStart w:id="34" w:name="_Toc207009791"/>
+      <w:bookmarkStart w:id="34" w:name="_Toc207087309"/>
       <w:bookmarkEnd w:id="31"/>
       <w:r>
         <w:t>Throughput</w:t>
@@ -4964,6 +4932,7 @@
           <w:i/>
           <w:iCs/>
         </w:rPr>
+        <w:lastRenderedPageBreak/>
         <w:t>Data-Dependent Acquisition (DDA)</w:t>
       </w:r>
       <w:r>
@@ -5017,229 +4986,229 @@
         <w:pStyle w:val="Heading1"/>
       </w:pPr>
       <w:bookmarkStart w:id="35" w:name="X687a79e35e48057445d6ea8ee1f6230db62eea3"/>
-      <w:bookmarkStart w:id="36" w:name="_Toc207009792"/>
+      <w:bookmarkStart w:id="36" w:name="_Toc207087310"/>
       <w:bookmarkEnd w:id="27"/>
       <w:bookmarkEnd w:id="33"/>
       <w:r>
+        <w:t>(</w:t>
+      </w:r>
+      <w:r>
+        <w:t>VI</w:t>
+      </w:r>
+      <w:r>
+        <w:t>) Applications of Mass Spectrometry in Proteomics</w:t>
+      </w:r>
+      <w:bookmarkEnd w:id="36"/>
+    </w:p>
+    <w:p>
+      <w:pPr>
+        <w:pStyle w:val="FirstParagraph"/>
+        <w:rPr>
+          <w:rFonts w:ascii="Arial" w:hAnsi="Arial" w:cs="Arial"/>
+        </w:rPr>
+      </w:pPr>
+      <w:r>
+        <w:rPr>
+          <w:rFonts w:ascii="Arial" w:hAnsi="Arial" w:cs="Arial"/>
+        </w:rPr>
+        <w:t>Mass spectrometry is central to nearly every facet of modern proteomics, enabling both broad discovery and targeted hypothesis-driven studies. Below is a list of the most common and impactful applications:</w:t>
+      </w:r>
+    </w:p>
+    <w:p>
+      <w:pPr>
+        <w:pStyle w:val="Heading2"/>
+      </w:pPr>
+      <w:bookmarkStart w:id="37" w:name="_Toc207087311"/>
+      <w:r>
+        <w:t>Protein Identification</w:t>
+      </w:r>
+      <w:bookmarkEnd w:id="37"/>
+    </w:p>
+    <w:p>
+      <w:pPr>
+        <w:rPr>
+          <w:rFonts w:ascii="Arial" w:hAnsi="Arial" w:cs="Arial"/>
+        </w:rPr>
+      </w:pPr>
+      <w:r>
+        <w:rPr>
+          <w:rFonts w:ascii="Arial" w:hAnsi="Arial" w:cs="Arial"/>
+        </w:rPr>
+        <w:t>Determining the identity of proteins in complex biological samples by matching peptide fragmentation spectra to database sequences. This forms the foundation of bottom-up proteomics, enabling proteome-scale mapping in tissues, cells, and biofluids.</w:t>
+      </w:r>
+    </w:p>
+    <w:p>
+      <w:pPr>
+        <w:pStyle w:val="Heading2"/>
+      </w:pPr>
+      <w:bookmarkStart w:id="38" w:name="_Toc207087312"/>
+      <w:r>
+        <w:t>Quantitative Proteomics</w:t>
+      </w:r>
+      <w:bookmarkEnd w:id="38"/>
+    </w:p>
+    <w:p>
+      <w:pPr>
+        <w:rPr>
+          <w:rFonts w:ascii="Arial" w:hAnsi="Arial" w:cs="Arial"/>
+        </w:rPr>
+      </w:pPr>
+      <w:r>
+        <w:rPr>
+          <w:rFonts w:ascii="Arial" w:hAnsi="Arial" w:cs="Arial"/>
+        </w:rPr>
+        <w:t>Measuring relative or absolute protein abundance across different conditions using techniques like label-free quantification, SILAC or isobaric tags (TMT/iTRAQ). Enables global analysis of protein expression changes in response to drugs, disease, or environment.</w:t>
+      </w:r>
+    </w:p>
+    <w:p>
+      <w:pPr>
+        <w:pStyle w:val="Heading2"/>
+      </w:pPr>
+      <w:bookmarkStart w:id="39" w:name="_Toc207087313"/>
+      <w:r>
+        <w:t>Post-Translational Modification (PTM) Mapping</w:t>
+      </w:r>
+      <w:bookmarkEnd w:id="39"/>
+    </w:p>
+    <w:p>
+      <w:pPr>
+        <w:rPr>
+          <w:rFonts w:ascii="Arial" w:hAnsi="Arial" w:cs="Arial"/>
+        </w:rPr>
+      </w:pPr>
+      <w:r>
+        <w:rPr>
+          <w:rFonts w:ascii="Arial" w:hAnsi="Arial" w:cs="Arial"/>
+        </w:rPr>
+        <w:t>Detecting and localizing modifications like phosphorylation, acetylation, ubiquitination, and glycosylation on specific residues. Crucial for understanding dynamic cellular signaling, protein regulation, and disease mechanisms.</w:t>
+      </w:r>
+    </w:p>
+    <w:p>
+      <w:pPr>
+        <w:pStyle w:val="Heading2"/>
+      </w:pPr>
+      <w:bookmarkStart w:id="40" w:name="_Toc207087314"/>
+      <w:r>
+        <w:t>Biomarker Discovery</w:t>
+      </w:r>
+      <w:bookmarkEnd w:id="40"/>
+    </w:p>
+    <w:p>
+      <w:pPr>
+        <w:rPr>
+          <w:rFonts w:ascii="Arial" w:hAnsi="Arial" w:cs="Arial"/>
+        </w:rPr>
+      </w:pPr>
+      <w:r>
+        <w:rPr>
+          <w:rFonts w:ascii="Arial" w:hAnsi="Arial" w:cs="Arial"/>
+        </w:rPr>
+        <w:t>Identifying proteins whose abundance or modification state correlates with a disease state, therapeutic response, or clinical outcome. Common in cancer, cardiovascular, and neurodegenerative disease research, often using biofluids like plasma or urine.</w:t>
+      </w:r>
+    </w:p>
+    <w:p>
+      <w:pPr>
+        <w:pStyle w:val="Heading2"/>
+      </w:pPr>
+      <w:bookmarkStart w:id="41" w:name="_Toc207087315"/>
+      <w:proofErr w:type="spellStart"/>
+      <w:r>
+        <w:t>Proteoform</w:t>
+      </w:r>
+      <w:proofErr w:type="spellEnd"/>
+      <w:r>
+        <w:t xml:space="preserve"> Characterization</w:t>
+      </w:r>
+      <w:bookmarkEnd w:id="41"/>
+    </w:p>
+    <w:p>
+      <w:pPr>
+        <w:rPr>
+          <w:rFonts w:ascii="Arial" w:hAnsi="Arial" w:cs="Arial"/>
+        </w:rPr>
+      </w:pPr>
+      <w:r>
+        <w:rPr>
+          <w:rFonts w:ascii="Arial" w:hAnsi="Arial" w:cs="Arial"/>
+        </w:rPr>
+        <w:t>Using top-down proteomics to analyze intact proteins and reveal isoforms, splice variants, and combinatorial PTMs. Essential for studying protein complexity beyond the gene or peptide level.</w:t>
+      </w:r>
+    </w:p>
+    <w:p>
+      <w:pPr>
+        <w:pStyle w:val="Heading2"/>
+      </w:pPr>
+      <w:bookmarkStart w:id="42" w:name="_Toc207087316"/>
+      <w:r>
+        <w:t>Protein–Protein Interaction (PPI) Mapping</w:t>
+      </w:r>
+      <w:bookmarkEnd w:id="42"/>
+    </w:p>
+    <w:p>
+      <w:pPr>
+        <w:rPr>
+          <w:rFonts w:ascii="Arial" w:hAnsi="Arial" w:cs="Arial"/>
+        </w:rPr>
+      </w:pPr>
+      <w:r>
+        <w:rPr>
+          <w:rFonts w:ascii="Arial" w:hAnsi="Arial" w:cs="Arial"/>
+        </w:rPr>
+        <w:t>Identifying physical interactions via co-immunoprecipitation (co-IP), affinity purification–MS (AP-MS), or cross-linking MS. Reveals protein complex architecture and regulatory networks.</w:t>
+      </w:r>
+    </w:p>
+    <w:p>
+      <w:pPr>
+        <w:pStyle w:val="Heading2"/>
+      </w:pPr>
+      <w:bookmarkStart w:id="43" w:name="_Toc207087317"/>
+      <w:r>
+        <w:t>Subcellular or Spatial Proteomics</w:t>
+      </w:r>
+      <w:bookmarkEnd w:id="43"/>
+    </w:p>
+    <w:p>
+      <w:pPr>
+        <w:rPr>
+          <w:rFonts w:ascii="Arial" w:hAnsi="Arial" w:cs="Arial"/>
+        </w:rPr>
+      </w:pPr>
+      <w:r>
+        <w:rPr>
+          <w:rFonts w:ascii="Arial" w:hAnsi="Arial" w:cs="Arial"/>
+        </w:rPr>
+        <w:t>Determining protein composition in specific organelles (e.g., mitochondria, nucleus) or spatially resolved tissue regions using methods like laser capture microdissection or imaging mass spectrometry.</w:t>
+      </w:r>
+    </w:p>
+    <w:p>
+      <w:pPr>
+        <w:pStyle w:val="Heading2"/>
+      </w:pPr>
+      <w:bookmarkStart w:id="44" w:name="_Toc207087318"/>
+      <w:r>
         <w:lastRenderedPageBreak/>
-        <w:t>(</w:t>
-      </w:r>
-      <w:r>
-        <w:t>VI</w:t>
-      </w:r>
-      <w:r>
-        <w:t>) Applications of Mass Spectrometry in Proteomics</w:t>
-      </w:r>
-      <w:bookmarkEnd w:id="36"/>
-    </w:p>
-    <w:p>
-      <w:pPr>
-        <w:pStyle w:val="FirstParagraph"/>
-        <w:rPr>
-          <w:rFonts w:ascii="Arial" w:hAnsi="Arial" w:cs="Arial"/>
-        </w:rPr>
-      </w:pPr>
-      <w:r>
-        <w:rPr>
-          <w:rFonts w:ascii="Arial" w:hAnsi="Arial" w:cs="Arial"/>
-        </w:rPr>
-        <w:t>Mass spectrometry is central to nearly every facet of modern proteomics, enabling both broad discovery and targeted hypothesis-driven studies. Below is a list of the most common and impactful applications:</w:t>
+        <w:t>Chemical Proteomics / Drug Target Profiling</w:t>
+      </w:r>
+      <w:bookmarkEnd w:id="44"/>
+    </w:p>
+    <w:p>
+      <w:pPr>
+        <w:rPr>
+          <w:rFonts w:ascii="Arial" w:hAnsi="Arial" w:cs="Arial"/>
+        </w:rPr>
+      </w:pPr>
+      <w:r>
+        <w:rPr>
+          <w:rFonts w:ascii="Arial" w:hAnsi="Arial" w:cs="Arial"/>
+        </w:rPr>
+        <w:t>MS can identify drug–protein interactions or characterize target engagement using techniques like activity-based protein profiling (ABPP) or thermal shift proteomics. Common in pharmacology and chemical biology.</w:t>
       </w:r>
     </w:p>
     <w:p>
       <w:pPr>
         <w:pStyle w:val="Heading2"/>
       </w:pPr>
-      <w:bookmarkStart w:id="37" w:name="_Toc207009793"/>
-      <w:r>
-        <w:t>Protein Identification</w:t>
-      </w:r>
-      <w:bookmarkEnd w:id="37"/>
-    </w:p>
-    <w:p>
-      <w:pPr>
-        <w:rPr>
-          <w:rFonts w:ascii="Arial" w:hAnsi="Arial" w:cs="Arial"/>
-        </w:rPr>
-      </w:pPr>
-      <w:r>
-        <w:rPr>
-          <w:rFonts w:ascii="Arial" w:hAnsi="Arial" w:cs="Arial"/>
-        </w:rPr>
-        <w:t>Determining the identity of proteins in complex biological samples by matching peptide fragmentation spectra to database sequences. This forms the foundation of bottom-up proteomics, enabling proteome-scale mapping in tissues, cells, and biofluids.</w:t>
-      </w:r>
-    </w:p>
-    <w:p>
-      <w:pPr>
-        <w:pStyle w:val="Heading2"/>
-      </w:pPr>
-      <w:bookmarkStart w:id="38" w:name="_Toc207009794"/>
-      <w:r>
-        <w:t>Quantitative Proteomics</w:t>
-      </w:r>
-      <w:bookmarkEnd w:id="38"/>
-    </w:p>
-    <w:p>
-      <w:pPr>
-        <w:rPr>
-          <w:rFonts w:ascii="Arial" w:hAnsi="Arial" w:cs="Arial"/>
-        </w:rPr>
-      </w:pPr>
-      <w:r>
-        <w:rPr>
-          <w:rFonts w:ascii="Arial" w:hAnsi="Arial" w:cs="Arial"/>
-        </w:rPr>
-        <w:t>Measuring relative or absolute protein abundance across different conditions using techniques like label-free quantification, SILAC or isobaric tags (TMT/iTRAQ). Enables global analysis of protein expression changes in response to drugs, disease, or environment.</w:t>
-      </w:r>
-    </w:p>
-    <w:p>
-      <w:pPr>
-        <w:pStyle w:val="Heading2"/>
-      </w:pPr>
-      <w:bookmarkStart w:id="39" w:name="_Toc207009795"/>
-      <w:r>
-        <w:t>Post-Translational Modification (PTM) Mapping</w:t>
-      </w:r>
-      <w:bookmarkEnd w:id="39"/>
-    </w:p>
-    <w:p>
-      <w:pPr>
-        <w:rPr>
-          <w:rFonts w:ascii="Arial" w:hAnsi="Arial" w:cs="Arial"/>
-        </w:rPr>
-      </w:pPr>
-      <w:r>
-        <w:rPr>
-          <w:rFonts w:ascii="Arial" w:hAnsi="Arial" w:cs="Arial"/>
-        </w:rPr>
-        <w:t>Detecting and localizing modifications like phosphorylation, acetylation, ubiquitination, and glycosylation on specific residues. Crucial for understanding dynamic cellular signaling, protein regulation, and disease mechanisms.</w:t>
-      </w:r>
-    </w:p>
-    <w:p>
-      <w:pPr>
-        <w:pStyle w:val="Heading2"/>
-      </w:pPr>
-      <w:bookmarkStart w:id="40" w:name="_Toc207009796"/>
-      <w:r>
-        <w:t>Biomarker Discovery</w:t>
-      </w:r>
-      <w:bookmarkEnd w:id="40"/>
-    </w:p>
-    <w:p>
-      <w:pPr>
-        <w:rPr>
-          <w:rFonts w:ascii="Arial" w:hAnsi="Arial" w:cs="Arial"/>
-        </w:rPr>
-      </w:pPr>
-      <w:r>
-        <w:rPr>
-          <w:rFonts w:ascii="Arial" w:hAnsi="Arial" w:cs="Arial"/>
-        </w:rPr>
-        <w:t>Identifying proteins whose abundance or modification state correlates with a disease state, therapeutic response, or clinical outcome. Common in cancer, cardiovascular, and neurodegenerative disease research, often using biofluids like plasma or urine.</w:t>
-      </w:r>
-    </w:p>
-    <w:p>
-      <w:pPr>
-        <w:pStyle w:val="Heading2"/>
-      </w:pPr>
-      <w:bookmarkStart w:id="41" w:name="_Toc207009797"/>
-      <w:proofErr w:type="spellStart"/>
-      <w:r>
-        <w:t>Proteoform</w:t>
-      </w:r>
-      <w:proofErr w:type="spellEnd"/>
-      <w:r>
-        <w:t xml:space="preserve"> Characterization</w:t>
-      </w:r>
-      <w:bookmarkEnd w:id="41"/>
-    </w:p>
-    <w:p>
-      <w:pPr>
-        <w:rPr>
-          <w:rFonts w:ascii="Arial" w:hAnsi="Arial" w:cs="Arial"/>
-        </w:rPr>
-      </w:pPr>
-      <w:r>
-        <w:rPr>
-          <w:rFonts w:ascii="Arial" w:hAnsi="Arial" w:cs="Arial"/>
-        </w:rPr>
-        <w:t>Using top-down proteomics to analyze intact proteins and reveal isoforms, splice variants, and combinatorial PTMs. Essential for studying protein complexity beyond the gene or peptide level.</w:t>
-      </w:r>
-    </w:p>
-    <w:p>
-      <w:pPr>
-        <w:pStyle w:val="Heading2"/>
-      </w:pPr>
-      <w:bookmarkStart w:id="42" w:name="_Toc207009798"/>
-      <w:r>
-        <w:t>Protein–Protein Interaction (PPI) Mapping</w:t>
-      </w:r>
-      <w:bookmarkEnd w:id="42"/>
-    </w:p>
-    <w:p>
-      <w:pPr>
-        <w:rPr>
-          <w:rFonts w:ascii="Arial" w:hAnsi="Arial" w:cs="Arial"/>
-        </w:rPr>
-      </w:pPr>
-      <w:r>
-        <w:rPr>
-          <w:rFonts w:ascii="Arial" w:hAnsi="Arial" w:cs="Arial"/>
-        </w:rPr>
-        <w:t>Identifying physical interactions via co-immunoprecipitation (co-IP), affinity purification–MS (AP-MS), or cross-linking MS. Reveals protein complex architecture and regulatory networks.</w:t>
-      </w:r>
-    </w:p>
-    <w:p>
-      <w:pPr>
-        <w:pStyle w:val="Heading2"/>
-      </w:pPr>
-      <w:bookmarkStart w:id="43" w:name="_Toc207009799"/>
-      <w:r>
-        <w:t>Subcellular or Spatial Proteomics</w:t>
-      </w:r>
-      <w:bookmarkEnd w:id="43"/>
-    </w:p>
-    <w:p>
-      <w:pPr>
-        <w:rPr>
-          <w:rFonts w:ascii="Arial" w:hAnsi="Arial" w:cs="Arial"/>
-        </w:rPr>
-      </w:pPr>
-      <w:r>
-        <w:rPr>
-          <w:rFonts w:ascii="Arial" w:hAnsi="Arial" w:cs="Arial"/>
-        </w:rPr>
-        <w:t>Determining protein composition in specific organelles (e.g., mitochondria, nucleus) or spatially resolved tissue regions using methods like laser capture microdissection or imaging mass spectrometry.</w:t>
-      </w:r>
-    </w:p>
-    <w:p>
-      <w:pPr>
-        <w:pStyle w:val="Heading2"/>
-      </w:pPr>
-      <w:bookmarkStart w:id="44" w:name="_Toc207009800"/>
-      <w:r>
-        <w:t>Chemical Proteomics / Drug Target Profiling</w:t>
-      </w:r>
-      <w:bookmarkEnd w:id="44"/>
-    </w:p>
-    <w:p>
-      <w:pPr>
-        <w:rPr>
-          <w:rFonts w:ascii="Arial" w:hAnsi="Arial" w:cs="Arial"/>
-        </w:rPr>
-      </w:pPr>
-      <w:r>
-        <w:rPr>
-          <w:rFonts w:ascii="Arial" w:hAnsi="Arial" w:cs="Arial"/>
-        </w:rPr>
-        <w:t>MS can identify drug–protein interactions or characterize target engagement using techniques like activity-based protein profiling (ABPP) or thermal shift proteomics. Common in pharmacology and chemical biology.</w:t>
-      </w:r>
-    </w:p>
-    <w:p>
-      <w:pPr>
-        <w:pStyle w:val="Heading2"/>
-      </w:pPr>
-      <w:bookmarkStart w:id="45" w:name="_Toc207009801"/>
+      <w:bookmarkStart w:id="45" w:name="_Toc207087319"/>
       <w:r>
         <w:t>Environmental and Microbial Proteomics</w:t>
       </w:r>
@@ -5257,9 +5226,9 @@
         </w:rPr>
         <w:t>Profiling microbial communities or single species under environmental stress or nutrient shifts. Important in metaproteomics, synthetic biology, and host–microbe interaction studies.</w:t>
       </w:r>
-    </w:p>
-    <w:bookmarkEnd w:id="0"/>
-    <w:bookmarkEnd w:id="35"/>
+      <w:bookmarkEnd w:id="0"/>
+      <w:bookmarkEnd w:id="35"/>
+    </w:p>
     <w:sectPr>
       <w:footerReference w:type="default" r:id="rId19"/>
       <w:pgSz w:w="12240" w:h="15840"/>
@@ -5306,7 +5275,6 @@
         <w:docPartUnique/>
       </w:docPartObj>
     </w:sdtPr>
-    <w:sdtEndPr/>
     <w:sdtContent>
       <w:sdt>
         <w:sdtPr>
@@ -5316,7 +5284,6 @@
             <w:docPartUnique/>
           </w:docPartObj>
         </w:sdtPr>
-        <w:sdtEndPr/>
         <w:sdtContent>
           <w:p>
             <w:pPr>

</xml_diff>